<commit_message>
Document local execution and finalize Word reports
</commit_message>
<xml_diff>
--- a/docs/WEEK2_PROJECT_REPORT.docx
+++ b/docs/WEEK2_PROJECT_REPORT.docx
@@ -283,7 +283,7 @@
               <w:rPr>
                 <w:sz w:val="19"/>
               </w:rPr>
-              <w:t>Hosted app</w:t>
+              <w:t>Execution</w:t>
             </w:r>
           </w:p>
         </w:tc>
@@ -300,7 +300,7 @@
               <w:rPr>
                 <w:sz w:val="19"/>
               </w:rPr>
-              <w:t>Deployment pending. Add the actual URL when available.</w:t>
+              <w:t>Local Streamlit app; no app login. Live requests use a locally configured Nebius API key.</w:t>
             </w:r>
           </w:p>
         </w:tc>
@@ -824,7 +824,7 @@
     </w:p>
     <w:p>
       <w:r>
-        <w:t>API keys remain in local environment settings or server secrets. They are excluded from GitHub and from this report. The public app requires no examiner password. Each hosted browser session has its own workspace; the server owner can access its stored data.</w:t>
+        <w:t>The Streamlit app runs on the local computer at http://127.0.0.1:8501. No app login is required. Live model requests use a Nebius API key stored in a local .env file; a reviewer reproducing the project supplies their own key. Credentials are excluded from GitHub and from this report.</w:t>
       </w:r>
     </w:p>
     <w:p>
@@ -3125,7 +3125,7 @@
     </w:p>
     <w:p>
       <w:r>
-        <w:t>The public repository contains the standalone app, prepared policy corpus, precomputed index, exact prompts, evaluation artifacts, tests and setup instructions. The hosted app has not been deployed yet. It can be run locally with Python 3.12 by following the repository README; live requests require an owner-configured Nebius key.</w:t>
+        <w:t>The public repository contains the standalone app, prepared policy corpus, precomputed index, exact prompts, evaluation artifacts, tests and setup instructions. Run it locally with Python 3.12 by following the repository README; live requests require a locally configured Nebius key.</w:t>
       </w:r>
     </w:p>
     <w:p>

</xml_diff>